<commit_message>
feat: integrate message selection toolbar into chat input area, update developer workflow guidelines, and refine export UI components
</commit_message>
<xml_diff>
--- a/src/backend/bisheng/workstation/assets/conversation_export_template.docx
+++ b/src/backend/bisheng/workstation/assets/conversation_export_template.docx
@@ -376,7 +376,7 @@
     <w:qFormat/>
     <w:rsid w:val="00FC693F"/>
     <w:rPr>
-      <w:rFonts w:ascii="Calibri" w:hAnsi="Calibri" w:eastAsia="Microsoft YaHei"/>
+      <w:rFonts w:ascii="Liberation Sans" w:hAnsi="Liberation Sans" w:eastAsia="WenQuanYi Zen Hei"/>
       <w:b w:val="0"/>
       <w:sz w:val="22"/>
     </w:rPr>
@@ -440,7 +440,7 @@
       <w:outlineLvl w:val="0"/>
     </w:pPr>
     <w:rPr>
-      <w:rFonts w:asciiTheme="majorHAnsi" w:eastAsiaTheme="majorEastAsia" w:hAnsiTheme="majorHAnsi" w:cstheme="majorBidi" w:ascii="Calibri" w:hAnsi="Calibri" w:eastAsia="Microsoft YaHei"/>
+      <w:rFonts w:asciiTheme="majorHAnsi" w:eastAsiaTheme="majorEastAsia" w:hAnsiTheme="majorHAnsi" w:cstheme="majorBidi" w:ascii="Liberation Sans" w:hAnsi="Liberation Sans" w:eastAsia="WenQuanYi Zen Hei"/>
       <w:b/>
       <w:bCs/>
       <w:color w:val="365F91" w:themeColor="accent1" w:themeShade="BF"/>
@@ -464,7 +464,7 @@
       <w:outlineLvl w:val="1"/>
     </w:pPr>
     <w:rPr>
-      <w:rFonts w:asciiTheme="majorHAnsi" w:eastAsiaTheme="majorEastAsia" w:hAnsiTheme="majorHAnsi" w:cstheme="majorBidi" w:ascii="Calibri" w:hAnsi="Calibri" w:eastAsia="Microsoft YaHei"/>
+      <w:rFonts w:asciiTheme="majorHAnsi" w:eastAsiaTheme="majorEastAsia" w:hAnsiTheme="majorHAnsi" w:cstheme="majorBidi" w:ascii="Liberation Sans" w:hAnsi="Liberation Sans" w:eastAsia="WenQuanYi Zen Hei"/>
       <w:b/>
       <w:bCs/>
       <w:color w:val="4F81BD" w:themeColor="accent1"/>
@@ -488,7 +488,7 @@
       <w:outlineLvl w:val="2"/>
     </w:pPr>
     <w:rPr>
-      <w:rFonts w:asciiTheme="majorHAnsi" w:eastAsiaTheme="majorEastAsia" w:hAnsiTheme="majorHAnsi" w:cstheme="majorBidi" w:ascii="Calibri" w:hAnsi="Calibri" w:eastAsia="Microsoft YaHei"/>
+      <w:rFonts w:asciiTheme="majorHAnsi" w:eastAsiaTheme="majorEastAsia" w:hAnsiTheme="majorHAnsi" w:cstheme="majorBidi" w:ascii="Liberation Sans" w:hAnsi="Liberation Sans" w:eastAsia="WenQuanYi Zen Hei"/>
       <w:b/>
       <w:bCs/>
       <w:color w:val="4F81BD" w:themeColor="accent1"/>
@@ -12067,7 +12067,7 @@
   <w:style w:type="character" w:customStyle="1" w:styleId="BoldLabel">
     <w:name w:val="BoldLabel"/>
     <w:rPr>
-      <w:rFonts w:ascii="Calibri" w:hAnsi="Calibri" w:eastAsia="Microsoft YaHei"/>
+      <w:rFonts w:ascii="Liberation Sans" w:hAnsi="Liberation Sans" w:eastAsia="WenQuanYi Zen Hei"/>
       <w:b/>
       <w:sz w:val="28"/>
     </w:rPr>
@@ -12078,7 +12078,7 @@
       <w:shd w:val="clear" w:color="auto" w:fill="F5F5F5"/>
     </w:pPr>
     <w:rPr>
-      <w:rFonts w:ascii="Calibri" w:hAnsi="Calibri" w:eastAsia="Consolas"/>
+      <w:rFonts w:ascii="Liberation Sans" w:hAnsi="Liberation Sans" w:eastAsia="Liberation Mono"/>
       <w:b w:val="0"/>
       <w:color w:val="333333"/>
       <w:sz w:val="20"/>
@@ -12087,7 +12087,7 @@
   <w:style w:type="character" w:customStyle="1" w:styleId="VerbatimChar">
     <w:name w:val="Verbatim Char"/>
     <w:rPr>
-      <w:rFonts w:ascii="Calibri" w:hAnsi="Calibri" w:eastAsia="Consolas"/>
+      <w:rFonts w:ascii="Liberation Sans" w:hAnsi="Liberation Sans" w:eastAsia="Liberation Mono"/>
       <w:b w:val="0"/>
       <w:sz w:val="20"/>
     </w:rPr>

</xml_diff>

<commit_message>
docs: update docs template
</commit_message>
<xml_diff>
--- a/src/backend/bisheng/workstation/assets/conversation_export_template.docx
+++ b/src/backend/bisheng/workstation/assets/conversation_export_template.docx
@@ -223,7 +223,7 @@
         <w:sz w:val="22"/>
         <w:szCs w:val="22"/>
         <w:lang w:val="en-US" w:eastAsia="en-US" w:bidi="ar-SA"/>
-        <w:rFonts w:ascii="Liberation Sans" w:hAnsi="Liberation Sans" w:eastAsia="WenQuanYi Zen Hei" w:cs="Liberation Sans"/>
+        <w:rFonts w:ascii="微软雅黑" w:hAnsi="微软雅黑" w:eastAsia="微软雅黑" w:cs="微软雅黑"/>
       </w:rPr>
     </w:rPrDefault>
     <w:pPrDefault>
@@ -376,7 +376,7 @@
     <w:qFormat/>
     <w:rsid w:val="00FC693F"/>
     <w:rPr>
-      <w:rFonts w:ascii="Liberation Sans" w:hAnsi="Liberation Sans" w:eastAsia="WenQuanYi Zen Hei"/>
+      <w:rFonts w:ascii="微软雅黑" w:hAnsi="微软雅黑" w:eastAsia="微软雅黑"/>
       <w:b w:val="0"/>
       <w:sz w:val="22"/>
     </w:rPr>
@@ -440,7 +440,7 @@
       <w:outlineLvl w:val="0"/>
     </w:pPr>
     <w:rPr>
-      <w:rFonts w:asciiTheme="majorHAnsi" w:eastAsiaTheme="majorEastAsia" w:hAnsiTheme="majorHAnsi" w:cstheme="majorBidi" w:ascii="Liberation Sans" w:hAnsi="Liberation Sans" w:eastAsia="WenQuanYi Zen Hei"/>
+      <w:rFonts w:asciiTheme="majorHAnsi" w:eastAsiaTheme="majorEastAsia" w:hAnsiTheme="majorHAnsi" w:cstheme="majorBidi" w:ascii="微软雅黑" w:hAnsi="微软雅黑" w:eastAsia="微软雅黑"/>
       <w:b/>
       <w:bCs/>
       <w:color w:val="365F91" w:themeColor="accent1" w:themeShade="BF"/>
@@ -464,7 +464,7 @@
       <w:outlineLvl w:val="1"/>
     </w:pPr>
     <w:rPr>
-      <w:rFonts w:asciiTheme="majorHAnsi" w:eastAsiaTheme="majorEastAsia" w:hAnsiTheme="majorHAnsi" w:cstheme="majorBidi" w:ascii="Liberation Sans" w:hAnsi="Liberation Sans" w:eastAsia="WenQuanYi Zen Hei"/>
+      <w:rFonts w:asciiTheme="majorHAnsi" w:eastAsiaTheme="majorEastAsia" w:hAnsiTheme="majorHAnsi" w:cstheme="majorBidi" w:ascii="微软雅黑" w:hAnsi="微软雅黑" w:eastAsia="微软雅黑"/>
       <w:b/>
       <w:bCs/>
       <w:color w:val="4F81BD" w:themeColor="accent1"/>
@@ -488,7 +488,7 @@
       <w:outlineLvl w:val="2"/>
     </w:pPr>
     <w:rPr>
-      <w:rFonts w:asciiTheme="majorHAnsi" w:eastAsiaTheme="majorEastAsia" w:hAnsiTheme="majorHAnsi" w:cstheme="majorBidi" w:ascii="Liberation Sans" w:hAnsi="Liberation Sans" w:eastAsia="WenQuanYi Zen Hei"/>
+      <w:rFonts w:asciiTheme="majorHAnsi" w:eastAsiaTheme="majorEastAsia" w:hAnsiTheme="majorHAnsi" w:cstheme="majorBidi" w:ascii="微软雅黑" w:hAnsi="微软雅黑" w:eastAsia="微软雅黑"/>
       <w:b/>
       <w:bCs/>
       <w:color w:val="4F81BD" w:themeColor="accent1"/>
@@ -12067,7 +12067,7 @@
   <w:style w:type="character" w:customStyle="1" w:styleId="BoldLabel">
     <w:name w:val="BoldLabel"/>
     <w:rPr>
-      <w:rFonts w:ascii="Liberation Sans" w:hAnsi="Liberation Sans" w:eastAsia="WenQuanYi Zen Hei"/>
+      <w:rFonts w:ascii="微软雅黑" w:hAnsi="微软雅黑" w:eastAsia="微软雅黑"/>
       <w:b/>
       <w:sz w:val="28"/>
     </w:rPr>
@@ -12078,7 +12078,7 @@
       <w:shd w:val="clear" w:color="auto" w:fill="F5F5F5"/>
     </w:pPr>
     <w:rPr>
-      <w:rFonts w:ascii="Liberation Sans" w:hAnsi="Liberation Sans" w:eastAsia="Liberation Mono"/>
+      <w:rFonts w:ascii="微软雅黑" w:hAnsi="微软雅黑" w:eastAsia="Liberation Mono"/>
       <w:b w:val="0"/>
       <w:color w:val="333333"/>
       <w:sz w:val="20"/>
@@ -12087,7 +12087,7 @@
   <w:style w:type="character" w:customStyle="1" w:styleId="VerbatimChar">
     <w:name w:val="Verbatim Char"/>
     <w:rPr>
-      <w:rFonts w:ascii="Liberation Sans" w:hAnsi="Liberation Sans" w:eastAsia="Liberation Mono"/>
+      <w:rFonts w:ascii="微软雅黑" w:hAnsi="微软雅黑" w:eastAsia="Liberation Mono"/>
       <w:b w:val="0"/>
       <w:sz w:val="20"/>
     </w:rPr>
@@ -23945,7 +23945,7 @@
         <a:cs typeface=""/>
         <a:font script="Jpan" typeface="ＭＳ ゴシック"/>
         <a:font script="Hang" typeface="맑은 고딕"/>
-        <a:font script="Hans" typeface="宋体"/>
+        <a:font script="Hans" typeface="微软雅黑"/>
         <a:font script="Hant" typeface="新細明體"/>
         <a:font script="Arab" typeface="Times New Roman"/>
         <a:font script="Hebr" typeface="Times New Roman"/>
@@ -23980,7 +23980,7 @@
         <a:cs typeface=""/>
         <a:font script="Jpan" typeface="ＭＳ 明朝"/>
         <a:font script="Hang" typeface="맑은 고딕"/>
-        <a:font script="Hans" typeface="宋体"/>
+        <a:font script="Hans" typeface="微软雅黑"/>
         <a:font script="Hant" typeface="新細明體"/>
         <a:font script="Arab" typeface="Arial"/>
         <a:font script="Hebr" typeface="Arial"/>

</xml_diff>